<commit_message>
docs(fyp): simplify defense proposal synopsis text into clear, accessible plain English
</commit_message>
<xml_diff>
--- a/docs/Final Year Project (FYP) Defense Proposal Form(Final).docx
+++ b/docs/Final Year Project (FYP) Defense Proposal Form(Final).docx
@@ -53,10 +53,10 @@
               <w:right w:val="single" w:sz="5" w:space="0" w:color="475569"/>
             </w:tcBorders>
             <w:tcMar>
-              <w:top w:w="40" w:type="dxa"/>
-              <w:bottom w:w="40" w:type="dxa"/>
-              <w:left w:w="80" w:type="dxa"/>
-              <w:right w:w="80" w:type="dxa"/>
+              <w:top w:w="35" w:type="dxa"/>
+              <w:bottom w:w="35" w:type="dxa"/>
+              <w:left w:w="75" w:type="dxa"/>
+              <w:right w:w="75" w:type="dxa"/>
             </w:tcMar>
             <w:shd w:val="clear" w:color="auto" w:fill="F8FAFC"/>
           </w:tcPr>
@@ -84,10 +84,10 @@
               <w:right w:val="single" w:sz="5" w:space="0" w:color="475569"/>
             </w:tcBorders>
             <w:tcMar>
-              <w:top w:w="40" w:type="dxa"/>
-              <w:bottom w:w="40" w:type="dxa"/>
-              <w:left w:w="80" w:type="dxa"/>
-              <w:right w:w="80" w:type="dxa"/>
+              <w:top w:w="35" w:type="dxa"/>
+              <w:bottom w:w="35" w:type="dxa"/>
+              <w:left w:w="75" w:type="dxa"/>
+              <w:right w:w="75" w:type="dxa"/>
             </w:tcMar>
           </w:tcPr>
           <w:p>
@@ -114,10 +114,10 @@
               <w:right w:val="single" w:sz="5" w:space="0" w:color="475569"/>
             </w:tcBorders>
             <w:tcMar>
-              <w:top w:w="40" w:type="dxa"/>
-              <w:bottom w:w="40" w:type="dxa"/>
-              <w:left w:w="80" w:type="dxa"/>
-              <w:right w:w="80" w:type="dxa"/>
+              <w:top w:w="35" w:type="dxa"/>
+              <w:bottom w:w="35" w:type="dxa"/>
+              <w:left w:w="75" w:type="dxa"/>
+              <w:right w:w="75" w:type="dxa"/>
             </w:tcMar>
             <w:shd w:val="clear" w:color="auto" w:fill="F8FAFC"/>
           </w:tcPr>
@@ -145,10 +145,10 @@
               <w:right w:val="single" w:sz="5" w:space="0" w:color="475569"/>
             </w:tcBorders>
             <w:tcMar>
-              <w:top w:w="40" w:type="dxa"/>
-              <w:bottom w:w="40" w:type="dxa"/>
-              <w:left w:w="80" w:type="dxa"/>
-              <w:right w:w="80" w:type="dxa"/>
+              <w:top w:w="35" w:type="dxa"/>
+              <w:bottom w:w="35" w:type="dxa"/>
+              <w:left w:w="75" w:type="dxa"/>
+              <w:right w:w="75" w:type="dxa"/>
             </w:tcMar>
           </w:tcPr>
           <w:p>
@@ -177,10 +177,10 @@
               <w:right w:val="single" w:sz="5" w:space="0" w:color="475569"/>
             </w:tcBorders>
             <w:tcMar>
-              <w:top w:w="40" w:type="dxa"/>
-              <w:bottom w:w="40" w:type="dxa"/>
-              <w:left w:w="80" w:type="dxa"/>
-              <w:right w:w="80" w:type="dxa"/>
+              <w:top w:w="35" w:type="dxa"/>
+              <w:bottom w:w="35" w:type="dxa"/>
+              <w:left w:w="75" w:type="dxa"/>
+              <w:right w:w="75" w:type="dxa"/>
             </w:tcMar>
             <w:shd w:val="clear" w:color="auto" w:fill="F8FAFC"/>
           </w:tcPr>
@@ -208,10 +208,10 @@
               <w:right w:val="single" w:sz="5" w:space="0" w:color="475569"/>
             </w:tcBorders>
             <w:tcMar>
-              <w:top w:w="40" w:type="dxa"/>
-              <w:bottom w:w="40" w:type="dxa"/>
-              <w:left w:w="80" w:type="dxa"/>
-              <w:right w:w="80" w:type="dxa"/>
+              <w:top w:w="35" w:type="dxa"/>
+              <w:bottom w:w="35" w:type="dxa"/>
+              <w:left w:w="75" w:type="dxa"/>
+              <w:right w:w="75" w:type="dxa"/>
             </w:tcMar>
           </w:tcPr>
           <w:p>
@@ -240,10 +240,10 @@
               <w:right w:val="single" w:sz="5" w:space="0" w:color="475569"/>
             </w:tcBorders>
             <w:tcMar>
-              <w:top w:w="40" w:type="dxa"/>
-              <w:bottom w:w="40" w:type="dxa"/>
-              <w:left w:w="80" w:type="dxa"/>
-              <w:right w:w="80" w:type="dxa"/>
+              <w:top w:w="35" w:type="dxa"/>
+              <w:bottom w:w="35" w:type="dxa"/>
+              <w:left w:w="75" w:type="dxa"/>
+              <w:right w:w="75" w:type="dxa"/>
             </w:tcMar>
             <w:shd w:val="clear" w:color="auto" w:fill="F8FAFC"/>
           </w:tcPr>
@@ -271,10 +271,10 @@
               <w:right w:val="single" w:sz="5" w:space="0" w:color="475569"/>
             </w:tcBorders>
             <w:tcMar>
-              <w:top w:w="40" w:type="dxa"/>
-              <w:bottom w:w="40" w:type="dxa"/>
-              <w:left w:w="80" w:type="dxa"/>
-              <w:right w:w="80" w:type="dxa"/>
+              <w:top w:w="35" w:type="dxa"/>
+              <w:bottom w:w="35" w:type="dxa"/>
+              <w:left w:w="75" w:type="dxa"/>
+              <w:right w:w="75" w:type="dxa"/>
             </w:tcMar>
           </w:tcPr>
           <w:p>
@@ -303,10 +303,10 @@
               <w:right w:val="single" w:sz="5" w:space="0" w:color="475569"/>
             </w:tcBorders>
             <w:tcMar>
-              <w:top w:w="40" w:type="dxa"/>
-              <w:bottom w:w="40" w:type="dxa"/>
-              <w:left w:w="80" w:type="dxa"/>
-              <w:right w:w="80" w:type="dxa"/>
+              <w:top w:w="35" w:type="dxa"/>
+              <w:bottom w:w="35" w:type="dxa"/>
+              <w:left w:w="75" w:type="dxa"/>
+              <w:right w:w="75" w:type="dxa"/>
             </w:tcMar>
             <w:shd w:val="clear" w:color="auto" w:fill="F8FAFC"/>
           </w:tcPr>
@@ -334,10 +334,10 @@
               <w:right w:val="single" w:sz="5" w:space="0" w:color="475569"/>
             </w:tcBorders>
             <w:tcMar>
-              <w:top w:w="40" w:type="dxa"/>
-              <w:bottom w:w="40" w:type="dxa"/>
-              <w:left w:w="80" w:type="dxa"/>
-              <w:right w:w="80" w:type="dxa"/>
+              <w:top w:w="35" w:type="dxa"/>
+              <w:bottom w:w="35" w:type="dxa"/>
+              <w:left w:w="75" w:type="dxa"/>
+              <w:right w:w="75" w:type="dxa"/>
             </w:tcMar>
           </w:tcPr>
           <w:p>
@@ -364,10 +364,10 @@
               <w:right w:val="single" w:sz="5" w:space="0" w:color="475569"/>
             </w:tcBorders>
             <w:tcMar>
-              <w:top w:w="40" w:type="dxa"/>
-              <w:bottom w:w="40" w:type="dxa"/>
-              <w:left w:w="80" w:type="dxa"/>
-              <w:right w:w="80" w:type="dxa"/>
+              <w:top w:w="35" w:type="dxa"/>
+              <w:bottom w:w="35" w:type="dxa"/>
+              <w:left w:w="75" w:type="dxa"/>
+              <w:right w:w="75" w:type="dxa"/>
             </w:tcMar>
             <w:shd w:val="clear" w:color="auto" w:fill="F8FAFC"/>
           </w:tcPr>
@@ -395,10 +395,10 @@
               <w:right w:val="single" w:sz="5" w:space="0" w:color="475569"/>
             </w:tcBorders>
             <w:tcMar>
-              <w:top w:w="40" w:type="dxa"/>
-              <w:bottom w:w="40" w:type="dxa"/>
-              <w:left w:w="80" w:type="dxa"/>
-              <w:right w:w="80" w:type="dxa"/>
+              <w:top w:w="35" w:type="dxa"/>
+              <w:bottom w:w="35" w:type="dxa"/>
+              <w:left w:w="75" w:type="dxa"/>
+              <w:right w:w="75" w:type="dxa"/>
             </w:tcMar>
           </w:tcPr>
           <w:p>
@@ -453,10 +453,10 @@
               <w:right w:val="single" w:sz="5" w:space="0" w:color="475569"/>
             </w:tcBorders>
             <w:tcMar>
-              <w:top w:w="40" w:type="dxa"/>
-              <w:bottom w:w="40" w:type="dxa"/>
-              <w:left w:w="80" w:type="dxa"/>
-              <w:right w:w="80" w:type="dxa"/>
+              <w:top w:w="35" w:type="dxa"/>
+              <w:bottom w:w="35" w:type="dxa"/>
+              <w:left w:w="75" w:type="dxa"/>
+              <w:right w:w="75" w:type="dxa"/>
             </w:tcMar>
             <w:shd w:val="clear" w:color="auto" w:fill="F8FAFC"/>
           </w:tcPr>
@@ -484,10 +484,10 @@
               <w:right w:val="single" w:sz="5" w:space="0" w:color="475569"/>
             </w:tcBorders>
             <w:tcMar>
-              <w:top w:w="40" w:type="dxa"/>
-              <w:bottom w:w="40" w:type="dxa"/>
-              <w:left w:w="80" w:type="dxa"/>
-              <w:right w:w="80" w:type="dxa"/>
+              <w:top w:w="35" w:type="dxa"/>
+              <w:bottom w:w="35" w:type="dxa"/>
+              <w:left w:w="75" w:type="dxa"/>
+              <w:right w:w="75" w:type="dxa"/>
             </w:tcMar>
           </w:tcPr>
           <w:p>
@@ -516,10 +516,10 @@
               <w:right w:val="single" w:sz="5" w:space="0" w:color="475569"/>
             </w:tcBorders>
             <w:tcMar>
-              <w:top w:w="40" w:type="dxa"/>
-              <w:bottom w:w="40" w:type="dxa"/>
-              <w:left w:w="80" w:type="dxa"/>
-              <w:right w:w="80" w:type="dxa"/>
+              <w:top w:w="35" w:type="dxa"/>
+              <w:bottom w:w="35" w:type="dxa"/>
+              <w:left w:w="75" w:type="dxa"/>
+              <w:right w:w="75" w:type="dxa"/>
             </w:tcMar>
             <w:shd w:val="clear" w:color="auto" w:fill="F8FAFC"/>
           </w:tcPr>
@@ -547,10 +547,10 @@
               <w:right w:val="single" w:sz="5" w:space="0" w:color="475569"/>
             </w:tcBorders>
             <w:tcMar>
-              <w:top w:w="40" w:type="dxa"/>
-              <w:bottom w:w="40" w:type="dxa"/>
-              <w:left w:w="80" w:type="dxa"/>
-              <w:right w:w="80" w:type="dxa"/>
+              <w:top w:w="35" w:type="dxa"/>
+              <w:bottom w:w="35" w:type="dxa"/>
+              <w:left w:w="75" w:type="dxa"/>
+              <w:right w:w="75" w:type="dxa"/>
             </w:tcMar>
           </w:tcPr>
           <w:p>
@@ -579,10 +579,10 @@
               <w:right w:val="single" w:sz="5" w:space="0" w:color="475569"/>
             </w:tcBorders>
             <w:tcMar>
-              <w:top w:w="40" w:type="dxa"/>
-              <w:bottom w:w="40" w:type="dxa"/>
-              <w:left w:w="80" w:type="dxa"/>
-              <w:right w:w="80" w:type="dxa"/>
+              <w:top w:w="35" w:type="dxa"/>
+              <w:bottom w:w="35" w:type="dxa"/>
+              <w:left w:w="75" w:type="dxa"/>
+              <w:right w:w="75" w:type="dxa"/>
             </w:tcMar>
             <w:shd w:val="clear" w:color="auto" w:fill="F8FAFC"/>
           </w:tcPr>
@@ -610,10 +610,10 @@
               <w:right w:val="single" w:sz="5" w:space="0" w:color="475569"/>
             </w:tcBorders>
             <w:tcMar>
-              <w:top w:w="40" w:type="dxa"/>
-              <w:bottom w:w="40" w:type="dxa"/>
-              <w:left w:w="80" w:type="dxa"/>
-              <w:right w:w="80" w:type="dxa"/>
+              <w:top w:w="35" w:type="dxa"/>
+              <w:bottom w:w="35" w:type="dxa"/>
+              <w:left w:w="75" w:type="dxa"/>
+              <w:right w:w="75" w:type="dxa"/>
             </w:tcMar>
           </w:tcPr>
           <w:p>
@@ -640,10 +640,10 @@
               <w:right w:val="single" w:sz="5" w:space="0" w:color="475569"/>
             </w:tcBorders>
             <w:tcMar>
-              <w:top w:w="40" w:type="dxa"/>
-              <w:bottom w:w="40" w:type="dxa"/>
-              <w:left w:w="80" w:type="dxa"/>
-              <w:right w:w="80" w:type="dxa"/>
+              <w:top w:w="35" w:type="dxa"/>
+              <w:bottom w:w="35" w:type="dxa"/>
+              <w:left w:w="75" w:type="dxa"/>
+              <w:right w:w="75" w:type="dxa"/>
             </w:tcMar>
             <w:shd w:val="clear" w:color="auto" w:fill="F8FAFC"/>
           </w:tcPr>
@@ -671,10 +671,10 @@
               <w:right w:val="single" w:sz="5" w:space="0" w:color="475569"/>
             </w:tcBorders>
             <w:tcMar>
-              <w:top w:w="40" w:type="dxa"/>
-              <w:bottom w:w="40" w:type="dxa"/>
-              <w:left w:w="80" w:type="dxa"/>
-              <w:right w:w="80" w:type="dxa"/>
+              <w:top w:w="35" w:type="dxa"/>
+              <w:bottom w:w="35" w:type="dxa"/>
+              <w:left w:w="75" w:type="dxa"/>
+              <w:right w:w="75" w:type="dxa"/>
             </w:tcMar>
           </w:tcPr>
           <w:p>
@@ -703,10 +703,10 @@
               <w:right w:val="single" w:sz="5" w:space="0" w:color="475569"/>
             </w:tcBorders>
             <w:tcMar>
-              <w:top w:w="40" w:type="dxa"/>
-              <w:bottom w:w="40" w:type="dxa"/>
-              <w:left w:w="80" w:type="dxa"/>
-              <w:right w:w="80" w:type="dxa"/>
+              <w:top w:w="35" w:type="dxa"/>
+              <w:bottom w:w="35" w:type="dxa"/>
+              <w:left w:w="75" w:type="dxa"/>
+              <w:right w:w="75" w:type="dxa"/>
             </w:tcMar>
             <w:shd w:val="clear" w:color="auto" w:fill="F8FAFC"/>
           </w:tcPr>
@@ -734,10 +734,10 @@
               <w:right w:val="single" w:sz="5" w:space="0" w:color="475569"/>
             </w:tcBorders>
             <w:tcMar>
-              <w:top w:w="40" w:type="dxa"/>
-              <w:bottom w:w="40" w:type="dxa"/>
-              <w:left w:w="80" w:type="dxa"/>
-              <w:right w:w="80" w:type="dxa"/>
+              <w:top w:w="35" w:type="dxa"/>
+              <w:bottom w:w="35" w:type="dxa"/>
+              <w:left w:w="75" w:type="dxa"/>
+              <w:right w:w="75" w:type="dxa"/>
             </w:tcMar>
           </w:tcPr>
           <w:p>
@@ -766,10 +766,10 @@
               <w:right w:val="single" w:sz="5" w:space="0" w:color="475569"/>
             </w:tcBorders>
             <w:tcMar>
-              <w:top w:w="40" w:type="dxa"/>
-              <w:bottom w:w="40" w:type="dxa"/>
-              <w:left w:w="80" w:type="dxa"/>
-              <w:right w:w="80" w:type="dxa"/>
+              <w:top w:w="35" w:type="dxa"/>
+              <w:bottom w:w="35" w:type="dxa"/>
+              <w:left w:w="75" w:type="dxa"/>
+              <w:right w:w="75" w:type="dxa"/>
             </w:tcMar>
             <w:shd w:val="clear" w:color="auto" w:fill="F8FAFC"/>
           </w:tcPr>
@@ -797,10 +797,10 @@
               <w:right w:val="single" w:sz="5" w:space="0" w:color="475569"/>
             </w:tcBorders>
             <w:tcMar>
-              <w:top w:w="40" w:type="dxa"/>
-              <w:bottom w:w="40" w:type="dxa"/>
-              <w:left w:w="80" w:type="dxa"/>
-              <w:right w:w="80" w:type="dxa"/>
+              <w:top w:w="35" w:type="dxa"/>
+              <w:bottom w:w="35" w:type="dxa"/>
+              <w:left w:w="75" w:type="dxa"/>
+              <w:right w:w="75" w:type="dxa"/>
             </w:tcMar>
           </w:tcPr>
           <w:p>
@@ -831,10 +831,10 @@
               <w:right w:val="single" w:sz="5" w:space="0" w:color="475569"/>
             </w:tcBorders>
             <w:tcMar>
-              <w:top w:w="40" w:type="dxa"/>
-              <w:bottom w:w="40" w:type="dxa"/>
-              <w:left w:w="80" w:type="dxa"/>
-              <w:right w:w="80" w:type="dxa"/>
+              <w:top w:w="35" w:type="dxa"/>
+              <w:bottom w:w="35" w:type="dxa"/>
+              <w:left w:w="75" w:type="dxa"/>
+              <w:right w:w="75" w:type="dxa"/>
             </w:tcMar>
             <w:shd w:val="clear" w:color="auto" w:fill="F8FAFC"/>
           </w:tcPr>
@@ -862,10 +862,10 @@
               <w:right w:val="single" w:sz="5" w:space="0" w:color="475569"/>
             </w:tcBorders>
             <w:tcMar>
-              <w:top w:w="40" w:type="dxa"/>
-              <w:bottom w:w="40" w:type="dxa"/>
-              <w:left w:w="80" w:type="dxa"/>
-              <w:right w:w="80" w:type="dxa"/>
+              <w:top w:w="35" w:type="dxa"/>
+              <w:bottom w:w="35" w:type="dxa"/>
+              <w:left w:w="75" w:type="dxa"/>
+              <w:right w:w="75" w:type="dxa"/>
             </w:tcMar>
           </w:tcPr>
           <w:p>
@@ -894,10 +894,10 @@
               <w:right w:val="single" w:sz="5" w:space="0" w:color="475569"/>
             </w:tcBorders>
             <w:tcMar>
-              <w:top w:w="40" w:type="dxa"/>
-              <w:bottom w:w="40" w:type="dxa"/>
-              <w:left w:w="80" w:type="dxa"/>
-              <w:right w:w="80" w:type="dxa"/>
+              <w:top w:w="35" w:type="dxa"/>
+              <w:bottom w:w="35" w:type="dxa"/>
+              <w:left w:w="75" w:type="dxa"/>
+              <w:right w:w="75" w:type="dxa"/>
             </w:tcMar>
             <w:shd w:val="clear" w:color="auto" w:fill="F8FAFC"/>
           </w:tcPr>
@@ -925,10 +925,10 @@
               <w:right w:val="single" w:sz="5" w:space="0" w:color="475569"/>
             </w:tcBorders>
             <w:tcMar>
-              <w:top w:w="40" w:type="dxa"/>
-              <w:bottom w:w="40" w:type="dxa"/>
-              <w:left w:w="80" w:type="dxa"/>
-              <w:right w:w="80" w:type="dxa"/>
+              <w:top w:w="35" w:type="dxa"/>
+              <w:bottom w:w="35" w:type="dxa"/>
+              <w:left w:w="75" w:type="dxa"/>
+              <w:right w:w="75" w:type="dxa"/>
             </w:tcMar>
           </w:tcPr>
           <w:p>
@@ -959,10 +959,10 @@
               <w:right w:val="single" w:sz="5" w:space="0" w:color="475569"/>
             </w:tcBorders>
             <w:tcMar>
-              <w:top w:w="40" w:type="dxa"/>
-              <w:bottom w:w="40" w:type="dxa"/>
-              <w:left w:w="80" w:type="dxa"/>
-              <w:right w:w="80" w:type="dxa"/>
+              <w:top w:w="35" w:type="dxa"/>
+              <w:bottom w:w="35" w:type="dxa"/>
+              <w:left w:w="75" w:type="dxa"/>
+              <w:right w:w="75" w:type="dxa"/>
             </w:tcMar>
             <w:shd w:val="clear" w:color="auto" w:fill="F8FAFC"/>
           </w:tcPr>
@@ -990,10 +990,10 @@
               <w:right w:val="single" w:sz="5" w:space="0" w:color="475569"/>
             </w:tcBorders>
             <w:tcMar>
-              <w:top w:w="40" w:type="dxa"/>
-              <w:bottom w:w="40" w:type="dxa"/>
-              <w:left w:w="80" w:type="dxa"/>
-              <w:right w:w="80" w:type="dxa"/>
+              <w:top w:w="35" w:type="dxa"/>
+              <w:bottom w:w="35" w:type="dxa"/>
+              <w:left w:w="75" w:type="dxa"/>
+              <w:right w:w="75" w:type="dxa"/>
             </w:tcMar>
           </w:tcPr>
           <w:p>
@@ -1020,10 +1020,10 @@
               <w:right w:val="single" w:sz="5" w:space="0" w:color="475569"/>
             </w:tcBorders>
             <w:tcMar>
-              <w:top w:w="40" w:type="dxa"/>
-              <w:bottom w:w="40" w:type="dxa"/>
-              <w:left w:w="80" w:type="dxa"/>
-              <w:right w:w="80" w:type="dxa"/>
+              <w:top w:w="35" w:type="dxa"/>
+              <w:bottom w:w="35" w:type="dxa"/>
+              <w:left w:w="75" w:type="dxa"/>
+              <w:right w:w="75" w:type="dxa"/>
             </w:tcMar>
             <w:shd w:val="clear" w:color="auto" w:fill="F8FAFC"/>
           </w:tcPr>
@@ -1051,10 +1051,10 @@
               <w:right w:val="single" w:sz="5" w:space="0" w:color="475569"/>
             </w:tcBorders>
             <w:tcMar>
-              <w:top w:w="40" w:type="dxa"/>
-              <w:bottom w:w="40" w:type="dxa"/>
-              <w:left w:w="80" w:type="dxa"/>
-              <w:right w:w="80" w:type="dxa"/>
+              <w:top w:w="35" w:type="dxa"/>
+              <w:bottom w:w="35" w:type="dxa"/>
+              <w:left w:w="75" w:type="dxa"/>
+              <w:right w:w="75" w:type="dxa"/>
             </w:tcMar>
           </w:tcPr>
           <w:p>
@@ -1108,10 +1108,10 @@
             </w:tcBorders>
             <w:shd w:val="clear" w:color="auto" w:fill="F8FAFC"/>
             <w:tcMar>
-              <w:top w:w="45" w:type="dxa"/>
-              <w:bottom w:w="45" w:type="dxa"/>
-              <w:left w:w="80" w:type="dxa"/>
-              <w:right w:w="80" w:type="dxa"/>
+              <w:top w:w="40" w:type="dxa"/>
+              <w:bottom w:w="40" w:type="dxa"/>
+              <w:left w:w="75" w:type="dxa"/>
+              <w:right w:w="75" w:type="dxa"/>
             </w:tcMar>
           </w:tcPr>
           <w:p>
@@ -1138,10 +1138,10 @@
               <w:right w:val="single" w:sz="5" w:space="0" w:color="475569"/>
             </w:tcBorders>
             <w:tcMar>
-              <w:top w:w="45" w:type="dxa"/>
-              <w:bottom w:w="45" w:type="dxa"/>
-              <w:left w:w="80" w:type="dxa"/>
-              <w:right w:w="80" w:type="dxa"/>
+              <w:top w:w="40" w:type="dxa"/>
+              <w:bottom w:w="40" w:type="dxa"/>
+              <w:left w:w="75" w:type="dxa"/>
+              <w:right w:w="75" w:type="dxa"/>
             </w:tcMar>
           </w:tcPr>
           <w:p>
@@ -1171,10 +1171,10 @@
             </w:tcBorders>
             <w:shd w:val="clear" w:color="auto" w:fill="F8FAFC"/>
             <w:tcMar>
-              <w:top w:w="45" w:type="dxa"/>
-              <w:bottom w:w="45" w:type="dxa"/>
-              <w:left w:w="80" w:type="dxa"/>
-              <w:right w:w="80" w:type="dxa"/>
+              <w:top w:w="40" w:type="dxa"/>
+              <w:bottom w:w="40" w:type="dxa"/>
+              <w:left w:w="75" w:type="dxa"/>
+              <w:right w:w="75" w:type="dxa"/>
             </w:tcMar>
           </w:tcPr>
           <w:p>
@@ -1201,10 +1201,10 @@
               <w:right w:val="single" w:sz="5" w:space="0" w:color="475569"/>
             </w:tcBorders>
             <w:tcMar>
-              <w:top w:w="45" w:type="dxa"/>
-              <w:bottom w:w="45" w:type="dxa"/>
-              <w:left w:w="80" w:type="dxa"/>
-              <w:right w:w="80" w:type="dxa"/>
+              <w:top w:w="40" w:type="dxa"/>
+              <w:bottom w:w="40" w:type="dxa"/>
+              <w:left w:w="75" w:type="dxa"/>
+              <w:right w:w="75" w:type="dxa"/>
             </w:tcMar>
           </w:tcPr>
           <w:p>
@@ -1234,10 +1234,10 @@
             </w:tcBorders>
             <w:shd w:val="clear" w:color="auto" w:fill="F8FAFC"/>
             <w:tcMar>
-              <w:top w:w="45" w:type="dxa"/>
-              <w:bottom w:w="45" w:type="dxa"/>
-              <w:left w:w="80" w:type="dxa"/>
-              <w:right w:w="80" w:type="dxa"/>
+              <w:top w:w="40" w:type="dxa"/>
+              <w:bottom w:w="40" w:type="dxa"/>
+              <w:left w:w="75" w:type="dxa"/>
+              <w:right w:w="75" w:type="dxa"/>
             </w:tcMar>
           </w:tcPr>
           <w:p>
@@ -1264,10 +1264,10 @@
               <w:right w:val="single" w:sz="5" w:space="0" w:color="475569"/>
             </w:tcBorders>
             <w:tcMar>
-              <w:top w:w="45" w:type="dxa"/>
-              <w:bottom w:w="45" w:type="dxa"/>
-              <w:left w:w="80" w:type="dxa"/>
-              <w:right w:w="80" w:type="dxa"/>
+              <w:top w:w="40" w:type="dxa"/>
+              <w:bottom w:w="40" w:type="dxa"/>
+              <w:left w:w="75" w:type="dxa"/>
+              <w:right w:w="75" w:type="dxa"/>
             </w:tcMar>
           </w:tcPr>
           <w:p>
@@ -1319,10 +1319,10 @@
               <w:right w:val="single" w:sz="5" w:space="0" w:color="475569"/>
             </w:tcBorders>
             <w:tcMar>
-              <w:top w:w="60" w:type="dxa"/>
-              <w:bottom w:w="60" w:type="dxa"/>
-              <w:left w:w="100" w:type="dxa"/>
-              <w:right w:w="100" w:type="dxa"/>
+              <w:top w:w="55" w:type="dxa"/>
+              <w:bottom w:w="55" w:type="dxa"/>
+              <w:left w:w="90" w:type="dxa"/>
+              <w:right w:w="90" w:type="dxa"/>
             </w:tcMar>
             <w:shd w:val="clear" w:color="auto" w:fill="FFFFFF"/>
           </w:tcPr>
@@ -1335,7 +1335,7 @@
                 <w:rFonts w:ascii="Times New Roman" w:hAnsi="Times New Roman"/>
                 <w:sz w:val="19"/>
               </w:rPr>
-              <w:t>Coordinating autonomous Unmanned Aerial Vehicle (UAV) swarms for search and rescue, disaster assessment, and tactical surveillance in dense urban topographies presents severe trajectory and collision challenges. Physical multi-drone testing is prohibitively expensive, safety-critical, and non-repeatable across hazardous disaster events. This project develops an AI-enabled Geospatial Digital Twin that reconstructs simulation-ready, watertight 3D operational environments from sub-meter optical satellite imagery (SpaceNet 2) and normalized Digital Surface Models (nDSM). Operating within this physics-accurate twin, a Multi-Agent Deep Reinforcement Learning (MADRL) architecture—leveraging Multi-Agent PPO (MAPPO) with Centralized Training and Decentralized Execution (CTDE)—is trained to coordinate 6-DOF autonomous UAV swarms. Drone agents utilize simulated 32-beam LiDAR and GPS-degraded kinematic state estimation to learn cooperative area coverage, dynamic obstacle avoidance, catenary powerline traversal, and acoustic beacon localization. Swarm performance is quantitatively benchmarked against classical 3D A* and decentralized RRT* algorithms across mission completion time, energy efficiency, and safety margins. A real-time 3D mission control HUD provides telemetry observation and spatial analytics for mission commanders.</w:t>
+              <w:t>Drones are increasingly vital for disaster management, search and rescue, and environmental monitoring. However, flying a team of multiple autonomous drones (a swarm) in crowded cities is challenging because drones can easily collide with buildings, power lines, or each other. Testing real drones in physical cities is also expensive and dangerous. This project creates a 'Geospatial Digital Twin'—a realistic 3D computer model of a real city built directly from satellite images and ground elevation data. Inside this virtual world, we use Artificial Intelligence (Multi-Agent Reinforcement Learning) to teach a team of drones how to fly together autonomously. The drones learn by practice how to coordinate search patterns, avoid obstacles like buildings and overhead wires, and locate emergency rescue sound beacons without human pilots. We evaluate swarm performance by measuring mission completion time, area coverage, battery efficiency, and collision-free safety. Finally, an interactive 3D computer dashboard is developed so mission operators can observe the drones and track flight telemetry in real time.</w:t>
             </w:r>
           </w:p>
           <w:p>
@@ -1349,7 +1349,7 @@
                 <w:color w:val="64748B"/>
                 <w:sz w:val="17"/>
               </w:rPr>
-              <w:t>[Exact Word Count: 159 words | Verified strictly &lt; 200 words]</w:t>
+              <w:t>[Word Count: 161 words | Verified strictly &lt; 200 words]</w:t>
             </w:r>
           </w:p>
         </w:tc>
@@ -1393,10 +1393,10 @@
               <w:right w:val="single" w:sz="5" w:space="0" w:color="475569"/>
             </w:tcBorders>
             <w:tcMar>
-              <w:top w:w="70" w:type="dxa"/>
-              <w:bottom w:w="70" w:type="dxa"/>
-              <w:left w:w="100" w:type="dxa"/>
-              <w:right w:w="100" w:type="dxa"/>
+              <w:top w:w="65" w:type="dxa"/>
+              <w:bottom w:w="65" w:type="dxa"/>
+              <w:left w:w="90" w:type="dxa"/>
+              <w:right w:w="90" w:type="dxa"/>
             </w:tcMar>
           </w:tcPr>
           <w:p>
@@ -1409,14 +1409,14 @@
                 <w:b/>
                 <w:sz w:val="19"/>
               </w:rPr>
-              <w:t xml:space="preserve">1. Automated 3D Digital Twin Reconstruction: </w:t>
+              <w:t xml:space="preserve">1. Build a 3D Virtual City (Digital Twin): </w:t>
             </w:r>
             <w:r>
               <w:rPr>
                 <w:rFonts w:ascii="Times New Roman" w:hAnsi="Times New Roman"/>
                 <w:sz w:val="19"/>
               </w:rPr>
-              <w:t>To develop an automated geospatial reconstruction toolchain converting high-resolution optical satellite imagery (SpaceNet 2) and DEM topographic elevations into watertight, collision-ready 3D manifold meshes with localized micro-hazards (catenary powerlines and vegetation volumes).</w:t>
+              <w:t>To automatically convert high-resolution optical satellite imagery and elevation data into a realistic 3D virtual environment with accurate building shapes, terrain heights, and low-altitude hazards such as power lines.</w:t>
             </w:r>
           </w:p>
           <w:p>
@@ -1429,14 +1429,14 @@
                 <w:b/>
                 <w:sz w:val="19"/>
               </w:rPr>
-              <w:t xml:space="preserve">2. 6-DOF Aerodynamic Swarm Formulation: </w:t>
+              <w:t xml:space="preserve">2. Simulate Realistic Drone Flight: </w:t>
             </w:r>
             <w:r>
               <w:rPr>
                 <w:rFonts w:ascii="Times New Roman" w:hAnsi="Times New Roman"/>
                 <w:sz w:val="19"/>
               </w:rPr>
-              <w:t>To formulate and simulate 6-DOF quadrotor kinematic and aerodynamic agent models subject to rotor thrust limits, gyroscopic drag, 32-beam LiDAR emulation, and acoustic rescue beacon chirps.</w:t>
+              <w:t>To simulate multiple quadcopter drones with realistic physical movement, motor thrust, battery energy limits, distance-measuring laser sensors (LiDAR), and emergency sound detectors.</w:t>
             </w:r>
           </w:p>
           <w:p>
@@ -1449,14 +1449,14 @@
                 <w:b/>
                 <w:sz w:val="19"/>
               </w:rPr>
-              <w:t xml:space="preserve">3. Multi-Agent Reinforcement Learning Engine: </w:t>
+              <w:t xml:space="preserve">3. Train AI for Drone Teamwork: </w:t>
             </w:r>
             <w:r>
               <w:rPr>
                 <w:rFonts w:ascii="Times New Roman" w:hAnsi="Times New Roman"/>
                 <w:sz w:val="19"/>
               </w:rPr>
-              <w:t>To design and train a scalable Multi-Agent Deep Reinforcement Learning (MADRL) framework based on Multi-Agent PPO (MAPPO) with Centralized Training and Decentralized Execution (CTDE) for cooperative swarm navigation.</w:t>
+              <w:t>To train an artificial intelligence framework (Multi-Agent Deep Reinforcement Learning) where drones learn to fly together as a cooperative team without colliding with obstacles or each other.</w:t>
             </w:r>
           </w:p>
           <w:p>
@@ -1469,14 +1469,14 @@
                 <w:b/>
                 <w:sz w:val="19"/>
               </w:rPr>
-              <w:t xml:space="preserve">4. Dynamic Disaster Scenario Emulation: </w:t>
+              <w:t xml:space="preserve">4. Test Under Challenging Scenarios: </w:t>
             </w:r>
             <w:r>
               <w:rPr>
                 <w:rFonts w:ascii="Times New Roman" w:hAnsi="Times New Roman"/>
                 <w:sz w:val="19"/>
               </w:rPr>
-              <w:t>To simulate stochastic, high-entropy environmental conditions, including moving obstacles, catenary wire entanglements, wind shear perturbations, individual motor failures, and intermittent communication loss.</w:t>
+              <w:t>To test the drone swarm under difficult disaster conditions, including moving obstacles, windy weather, single-drone motor failures, and weak communication signals.</w:t>
             </w:r>
           </w:p>
           <w:p>
@@ -1489,14 +1489,14 @@
                 <w:b/>
                 <w:sz w:val="19"/>
               </w:rPr>
-              <w:t xml:space="preserve">5. Quantitative Benchmarking &amp; Safety Evaluation: </w:t>
+              <w:t xml:space="preserve">5. Measure and Compare Performance: </w:t>
             </w:r>
             <w:r>
               <w:rPr>
                 <w:rFonts w:ascii="Times New Roman" w:hAnsi="Times New Roman"/>
                 <w:sz w:val="19"/>
               </w:rPr>
-              <w:t>To benchmark swarm flight metrics against classical centralized 3D A* and decentralized RRT* baselines across mission completion duration, area coverage rate, collision frequency, and energy consumption.</w:t>
+              <w:t>To evaluate swarm success using clear practical metrics (search speed, area covered, battery usage, and zero crashes) and compare the AI against traditional flight navigation methods.</w:t>
             </w:r>
           </w:p>
           <w:p>
@@ -1509,14 +1509,14 @@
                 <w:b/>
                 <w:sz w:val="19"/>
               </w:rPr>
-              <w:t xml:space="preserve">6. Tactical Mission Control Interface: </w:t>
+              <w:t xml:space="preserve">6. Build a 3D Mission Control Screen: </w:t>
             </w:r>
             <w:r>
               <w:rPr>
                 <w:rFonts w:ascii="Times New Roman" w:hAnsi="Times New Roman"/>
                 <w:sz w:val="19"/>
               </w:rPr>
-              <w:t>To construct an interactive 3D WebGL tactical HUD and mission telemetry dashboard for real-time visualization of UAV trajectories, battery states, sensor feeds, and mission progress.</w:t>
+              <w:t>To develop an interactive 3D visual dashboard where operators can see drone locations, watch live flight paths, and monitor mission progress in real time.</w:t>
             </w:r>
           </w:p>
         </w:tc>
@@ -1555,10 +1555,10 @@
               <w:right w:val="single" w:sz="5" w:space="0" w:color="475569"/>
             </w:tcBorders>
             <w:tcMar>
-              <w:top w:w="70" w:type="dxa"/>
-              <w:bottom w:w="70" w:type="dxa"/>
-              <w:left w:w="100" w:type="dxa"/>
-              <w:right w:w="100" w:type="dxa"/>
+              <w:top w:w="65" w:type="dxa"/>
+              <w:bottom w:w="65" w:type="dxa"/>
+              <w:left w:w="90" w:type="dxa"/>
+              <w:right w:w="90" w:type="dxa"/>
             </w:tcMar>
           </w:tcPr>
           <w:p>
@@ -1571,14 +1571,14 @@
                 <w:b/>
                 <w:sz w:val="19"/>
               </w:rPr>
-              <w:t xml:space="preserve">Stage 1 — Satellite Semantic Extraction &amp; Topography (src/data_prep/): </w:t>
+              <w:t xml:space="preserve">Stage 1 — Satellite Image Processing &amp; Terrain Mapping (src/data_prep/): </w:t>
             </w:r>
             <w:r>
               <w:rPr>
                 <w:rFonts w:ascii="Times New Roman" w:hAnsi="Times New Roman"/>
                 <w:sz w:val="19"/>
               </w:rPr>
-              <w:t>The framework consumes 0.3m optical satellite imagery from SpaceNet 2 Las Vegas. A deep convolutional U-Net with ResNet-34 backbone is fine-tuned to extract building footprints (test IoU 0.8062, F1 0.8927). Building masks are vectorized into georeferenced polygons in WGS84 (EPSG:4326). Ground elevations are queried from AWS Terrarium DEM tiles using sub-millisecond bilinear interpolation, while normalized Digital Surface Models (nDSM) and solar shadow trigonometry validate structural building heights.</w:t>
+              <w:t>We take high-resolution satellite imagery from SpaceNet 2 and train an AI computer-vision model (U-Net) to detect and trace rooftop outlines. These outlines are turned into digital map shapes tagged with real GPS coordinates. Next, we use ground elevation maps (DEM) and calculate building heights from satellite shadows so each building sits accurately on the ground at its true real-world height.</w:t>
             </w:r>
           </w:p>
           <w:p>
@@ -1591,14 +1591,14 @@
                 <w:b/>
                 <w:sz w:val="19"/>
               </w:rPr>
-              <w:t xml:space="preserve">Stage 2 — 3D Digital Twin Mesh Manifolding &amp; Micro-Hazards (src/geometry/): </w:t>
+              <w:t xml:space="preserve">Stage 2 — Creating the 3D Virtual City &amp; Hazards (src/geometry/): </w:t>
             </w:r>
             <w:r>
               <w:rPr>
                 <w:rFonts w:ascii="Times New Roman" w:hAnsi="Times New Roman"/>
                 <w:sz w:val="19"/>
               </w:rPr>
-              <w:t>Extracted polygon cadastre footprints are converted into watertight, manifold 3D polygon meshes via automated Blender Python (bpy) extrusion and polygon triangulation. Critical micro-hazards are procedurally modeled into the airspace: catenary powerlines using hyperbolic cosine equations (y = a · [cosh(x/a) - 1]) between transmission poles, and vegetation canopy exclusion zones using SAVI vegetation masks.</w:t>
+              <w:t>Using 3D modeling tools (Blender and Python scripts), we extrude the flat 2D building outlines into solid 3D structures. We ensure the 3D models are 'watertight'—meaning they have clean, solid walls with no gaps so simulated drones cannot accidentally fly through them. We also place common low-altitude flight hazards into the air, including curved overhead electrical power lines and tall trees.</w:t>
             </w:r>
           </w:p>
           <w:p>
@@ -1611,14 +1611,14 @@
                 <w:b/>
                 <w:sz w:val="19"/>
               </w:rPr>
-              <w:t xml:space="preserve">Stage 3 — Real-Time Physics Simulator &amp; 6-DOF UAV Kinematics (src/physics_sim/): </w:t>
+              <w:t xml:space="preserve">Stage 3 — Realistic Drone Flight Physics &amp; Sensors (src/physics_sim/): </w:t>
             </w:r>
             <w:r>
               <w:rPr>
                 <w:rFonts w:ascii="Times New Roman" w:hAnsi="Times New Roman"/>
                 <w:sz w:val="19"/>
               </w:rPr>
-              <w:t>The reconstructed geospatial environment is imported into a real-time simulation engine (Unreal Engine 5 Chaos Physics / lightweight headless 3D simulation). Heterogeneous quadrotor agents are modeled under full 6-DOF rigid-body kinematics (rotor thrust, aerodynamic drag, gravitational torque, and battery energy discharge). Each UAV is instrumented with an emulated 32-beam spherical LiDAR rangefinder and an omnidirectional acoustic receiver detecting emergency chirps.</w:t>
+              <w:t>We place quadcopter drones into the virtual 3D city using a physics simulation engine (Unreal Engine 5). The drones obey natural physics, including motor lift, air resistance, gravity, and battery discharge. Each drone is fitted with virtual distance sensors (32-beam laser LiDAR) that scan 360 degrees around the drone to detect walls, and an audio sensor that listens for emergency rescue chirps.</w:t>
             </w:r>
           </w:p>
         </w:tc>
@@ -1662,10 +1662,10 @@
               <w:right w:val="single" w:sz="5" w:space="0" w:color="475569"/>
             </w:tcBorders>
             <w:tcMar>
-              <w:top w:w="70" w:type="dxa"/>
-              <w:bottom w:w="70" w:type="dxa"/>
-              <w:left w:w="100" w:type="dxa"/>
-              <w:right w:w="100" w:type="dxa"/>
+              <w:top w:w="65" w:type="dxa"/>
+              <w:bottom w:w="65" w:type="dxa"/>
+              <w:left w:w="90" w:type="dxa"/>
+              <w:right w:w="90" w:type="dxa"/>
             </w:tcMar>
           </w:tcPr>
           <w:p>
@@ -1678,14 +1678,14 @@
                 <w:b/>
                 <w:sz w:val="19"/>
               </w:rPr>
-              <w:t xml:space="preserve">Stage 4 — Multi-Agent Deep Reinforcement Learning Swarm Engine (src/models/): </w:t>
+              <w:t xml:space="preserve">Stage 4 — Teaching the Drones with AI (src/models/): </w:t>
             </w:r>
             <w:r>
               <w:rPr>
                 <w:rFonts w:ascii="Times New Roman" w:hAnsi="Times New Roman"/>
                 <w:sz w:val="19"/>
               </w:rPr>
-              <w:t>Autonomous swarm coordination is governed by Multi-Agent Proximal Policy Optimization (MAPPO) with Centralized Training and Decentralized Execution (CTDE). During training, a centralized value network observes the global spatial state of the digital twin; during execution, decentralized actor networks generate continuous rotor velocity commands based strictly on local 32-beam LiDAR range vectors and inter-agent relative telemetry. A Pareto multi-objective reward function optimizes mission completion, formation cohesion, and collision avoidance.</w:t>
+              <w:t>We train the drone swarm using Multi-Agent Reinforcement Learning (MAPPO). In this approach, drones learn by trial and error: they get positive points for searching new areas and reaching targets, and heavy negative penalty points for crashing into walls or other drones. During training, a central computer monitors the entire area to guide learning. Once trained, each drone makes its own independent flight decisions using only its onboard sensors and short-range radio signals.</w:t>
             </w:r>
           </w:p>
           <w:p>
@@ -1698,14 +1698,14 @@
                 <w:b/>
                 <w:sz w:val="19"/>
               </w:rPr>
-              <w:t xml:space="preserve">Stage 5 — Benchmarking &amp; Tactical Mission HUD: </w:t>
+              <w:t xml:space="preserve">Stage 5 — Comparison Testing &amp; 3D Visual Interface: </w:t>
             </w:r>
             <w:r>
               <w:rPr>
                 <w:rFonts w:ascii="Times New Roman" w:hAnsi="Times New Roman"/>
                 <w:sz w:val="19"/>
               </w:rPr>
-              <w:t>The converged MAPPO swarm policy is benchmarked against centralized 3D A* and decentralized RRT* algorithms under dynamic scenarios (moving obstacles, catenary powerlines, motor dropouts, and communication packet loss). An interactive WebGL 3D Mission Control HUD renders real-time UAV trajectories, telemetry cards, and quantitative safety reports.</w:t>
+              <w:t>We test the trained AI drone swarm against standard textbook pathfinding methods (such as A* and RRT* algorithms) to demonstrate that our AI flies smoother, safer, and completes missions faster. Finally, we display the live drone flights on an interactive 3D web dashboard so operators can easily observe drone positions, battery levels, and mission progress.</w:t>
             </w:r>
           </w:p>
         </w:tc>
@@ -1748,10 +1748,10 @@
             </w:tcBorders>
             <w:shd w:val="clear" w:color="auto" w:fill="E2E8F0"/>
             <w:tcMar>
-              <w:top w:w="60" w:type="dxa"/>
-              <w:bottom w:w="60" w:type="dxa"/>
-              <w:left w:w="80" w:type="dxa"/>
-              <w:right w:w="80" w:type="dxa"/>
+              <w:top w:w="55" w:type="dxa"/>
+              <w:bottom w:w="55" w:type="dxa"/>
+              <w:left w:w="75" w:type="dxa"/>
+              <w:right w:w="75" w:type="dxa"/>
             </w:tcMar>
           </w:tcPr>
           <w:p>
@@ -1779,10 +1779,10 @@
             </w:tcBorders>
             <w:shd w:val="clear" w:color="auto" w:fill="E2E8F0"/>
             <w:tcMar>
-              <w:top w:w="60" w:type="dxa"/>
-              <w:bottom w:w="60" w:type="dxa"/>
-              <w:left w:w="80" w:type="dxa"/>
-              <w:right w:w="80" w:type="dxa"/>
+              <w:top w:w="55" w:type="dxa"/>
+              <w:bottom w:w="55" w:type="dxa"/>
+              <w:left w:w="75" w:type="dxa"/>
+              <w:right w:w="75" w:type="dxa"/>
             </w:tcMar>
           </w:tcPr>
           <w:p>
@@ -1810,10 +1810,10 @@
             </w:tcBorders>
             <w:shd w:val="clear" w:color="auto" w:fill="E2E8F0"/>
             <w:tcMar>
-              <w:top w:w="60" w:type="dxa"/>
-              <w:bottom w:w="60" w:type="dxa"/>
-              <w:left w:w="80" w:type="dxa"/>
-              <w:right w:w="80" w:type="dxa"/>
+              <w:top w:w="55" w:type="dxa"/>
+              <w:bottom w:w="55" w:type="dxa"/>
+              <w:left w:w="75" w:type="dxa"/>
+              <w:right w:w="75" w:type="dxa"/>
             </w:tcMar>
           </w:tcPr>
           <w:p>
@@ -1841,10 +1841,10 @@
             </w:tcBorders>
             <w:shd w:val="clear" w:color="auto" w:fill="E2E8F0"/>
             <w:tcMar>
-              <w:top w:w="60" w:type="dxa"/>
-              <w:bottom w:w="60" w:type="dxa"/>
-              <w:left w:w="80" w:type="dxa"/>
-              <w:right w:w="80" w:type="dxa"/>
+              <w:top w:w="55" w:type="dxa"/>
+              <w:bottom w:w="55" w:type="dxa"/>
+              <w:left w:w="75" w:type="dxa"/>
+              <w:right w:w="75" w:type="dxa"/>
             </w:tcMar>
           </w:tcPr>
           <w:p>
@@ -1873,10 +1873,10 @@
               <w:right w:val="single" w:sz="5" w:space="0" w:color="475569"/>
             </w:tcBorders>
             <w:tcMar>
-              <w:top w:w="50" w:type="dxa"/>
-              <w:bottom w:w="50" w:type="dxa"/>
-              <w:left w:w="80" w:type="dxa"/>
-              <w:right w:w="80" w:type="dxa"/>
+              <w:top w:w="45" w:type="dxa"/>
+              <w:bottom w:w="45" w:type="dxa"/>
+              <w:left w:w="75" w:type="dxa"/>
+              <w:right w:w="75" w:type="dxa"/>
             </w:tcMar>
           </w:tcPr>
           <w:p>
@@ -1904,10 +1904,10 @@
               <w:right w:val="single" w:sz="5" w:space="0" w:color="475569"/>
             </w:tcBorders>
             <w:tcMar>
-              <w:top w:w="50" w:type="dxa"/>
-              <w:bottom w:w="50" w:type="dxa"/>
-              <w:left w:w="80" w:type="dxa"/>
-              <w:right w:w="80" w:type="dxa"/>
+              <w:top w:w="45" w:type="dxa"/>
+              <w:bottom w:w="45" w:type="dxa"/>
+              <w:left w:w="75" w:type="dxa"/>
+              <w:right w:w="75" w:type="dxa"/>
             </w:tcMar>
           </w:tcPr>
           <w:p>
@@ -1937,10 +1937,10 @@
               <w:right w:val="single" w:sz="5" w:space="0" w:color="475569"/>
             </w:tcBorders>
             <w:tcMar>
-              <w:top w:w="50" w:type="dxa"/>
-              <w:bottom w:w="50" w:type="dxa"/>
-              <w:left w:w="80" w:type="dxa"/>
-              <w:right w:w="80" w:type="dxa"/>
+              <w:top w:w="45" w:type="dxa"/>
+              <w:bottom w:w="45" w:type="dxa"/>
+              <w:left w:w="75" w:type="dxa"/>
+              <w:right w:w="75" w:type="dxa"/>
             </w:tcMar>
           </w:tcPr>
           <w:p>
@@ -1954,7 +1954,7 @@
                 <w:b/>
                 <w:sz w:val="18"/>
               </w:rPr>
-              <w:t>Literature Review, System Requirements &amp; Mathematical Modeling</w:t>
+              <w:t>Literature Review &amp; System Design</w:t>
             </w:r>
           </w:p>
         </w:tc>
@@ -1968,10 +1968,10 @@
               <w:right w:val="single" w:sz="5" w:space="0" w:color="475569"/>
             </w:tcBorders>
             <w:tcMar>
-              <w:top w:w="50" w:type="dxa"/>
-              <w:bottom w:w="50" w:type="dxa"/>
-              <w:left w:w="80" w:type="dxa"/>
-              <w:right w:w="80" w:type="dxa"/>
+              <w:top w:w="45" w:type="dxa"/>
+              <w:bottom w:w="45" w:type="dxa"/>
+              <w:left w:w="75" w:type="dxa"/>
+              <w:right w:w="75" w:type="dxa"/>
             </w:tcMar>
           </w:tcPr>
           <w:p>
@@ -1985,7 +1985,7 @@
                 <w:b w:val="0"/>
                 <w:sz w:val="18"/>
               </w:rPr>
-              <w:t>Comprehensive literature review, 6-DOF kinematic formulations, and system architecture specification document.</w:t>
+              <w:t>Summary of existing research papers, drone flight equations, and overall system design plan.</w:t>
             </w:r>
           </w:p>
         </w:tc>
@@ -2001,10 +2001,10 @@
               <w:right w:val="single" w:sz="5" w:space="0" w:color="475569"/>
             </w:tcBorders>
             <w:tcMar>
-              <w:top w:w="50" w:type="dxa"/>
-              <w:bottom w:w="50" w:type="dxa"/>
-              <w:left w:w="80" w:type="dxa"/>
-              <w:right w:w="80" w:type="dxa"/>
+              <w:top w:w="45" w:type="dxa"/>
+              <w:bottom w:w="45" w:type="dxa"/>
+              <w:left w:w="75" w:type="dxa"/>
+              <w:right w:w="75" w:type="dxa"/>
             </w:tcMar>
             <w:shd w:val="clear" w:color="auto" w:fill="F8FAFC"/>
           </w:tcPr>
@@ -2033,10 +2033,10 @@
               <w:right w:val="single" w:sz="5" w:space="0" w:color="475569"/>
             </w:tcBorders>
             <w:tcMar>
-              <w:top w:w="50" w:type="dxa"/>
-              <w:bottom w:w="50" w:type="dxa"/>
-              <w:left w:w="80" w:type="dxa"/>
-              <w:right w:w="80" w:type="dxa"/>
+              <w:top w:w="45" w:type="dxa"/>
+              <w:bottom w:w="45" w:type="dxa"/>
+              <w:left w:w="75" w:type="dxa"/>
+              <w:right w:w="75" w:type="dxa"/>
             </w:tcMar>
             <w:shd w:val="clear" w:color="auto" w:fill="F8FAFC"/>
           </w:tcPr>
@@ -2067,10 +2067,10 @@
               <w:right w:val="single" w:sz="5" w:space="0" w:color="475569"/>
             </w:tcBorders>
             <w:tcMar>
-              <w:top w:w="50" w:type="dxa"/>
-              <w:bottom w:w="50" w:type="dxa"/>
-              <w:left w:w="80" w:type="dxa"/>
-              <w:right w:w="80" w:type="dxa"/>
+              <w:top w:w="45" w:type="dxa"/>
+              <w:bottom w:w="45" w:type="dxa"/>
+              <w:left w:w="75" w:type="dxa"/>
+              <w:right w:w="75" w:type="dxa"/>
             </w:tcMar>
             <w:shd w:val="clear" w:color="auto" w:fill="F8FAFC"/>
           </w:tcPr>
@@ -2085,7 +2085,7 @@
                 <w:b/>
                 <w:sz w:val="18"/>
               </w:rPr>
-              <w:t>Satellite Extraction Pipeline &amp; 3D Geospatial Digital Twin</w:t>
+              <w:t>Satellite Image Processing &amp; 3D Virtual City</w:t>
             </w:r>
           </w:p>
         </w:tc>
@@ -2099,10 +2099,10 @@
               <w:right w:val="single" w:sz="5" w:space="0" w:color="475569"/>
             </w:tcBorders>
             <w:tcMar>
-              <w:top w:w="50" w:type="dxa"/>
-              <w:bottom w:w="50" w:type="dxa"/>
-              <w:left w:w="80" w:type="dxa"/>
-              <w:right w:w="80" w:type="dxa"/>
+              <w:top w:w="45" w:type="dxa"/>
+              <w:bottom w:w="45" w:type="dxa"/>
+              <w:left w:w="75" w:type="dxa"/>
+              <w:right w:w="75" w:type="dxa"/>
             </w:tcMar>
             <w:shd w:val="clear" w:color="auto" w:fill="F8FAFC"/>
           </w:tcPr>
@@ -2117,7 +2117,7 @@
                 <w:b w:val="0"/>
                 <w:sz w:val="18"/>
               </w:rPr>
-              <w:t>Trained U-Net footprint segmentation model, vectorized building cadastre, nDSM height model, and automated watertight 3D mesh generator.</w:t>
+              <w:t>Trained building detection AI, digitized building map, height model, and completed 3D virtual city.</w:t>
             </w:r>
           </w:p>
         </w:tc>
@@ -2133,10 +2133,10 @@
               <w:right w:val="single" w:sz="5" w:space="0" w:color="475569"/>
             </w:tcBorders>
             <w:tcMar>
-              <w:top w:w="50" w:type="dxa"/>
-              <w:bottom w:w="50" w:type="dxa"/>
-              <w:left w:w="80" w:type="dxa"/>
-              <w:right w:w="80" w:type="dxa"/>
+              <w:top w:w="45" w:type="dxa"/>
+              <w:bottom w:w="45" w:type="dxa"/>
+              <w:left w:w="75" w:type="dxa"/>
+              <w:right w:w="75" w:type="dxa"/>
             </w:tcMar>
           </w:tcPr>
           <w:p>
@@ -2164,10 +2164,10 @@
               <w:right w:val="single" w:sz="5" w:space="0" w:color="475569"/>
             </w:tcBorders>
             <w:tcMar>
-              <w:top w:w="50" w:type="dxa"/>
-              <w:bottom w:w="50" w:type="dxa"/>
-              <w:left w:w="80" w:type="dxa"/>
-              <w:right w:w="80" w:type="dxa"/>
+              <w:top w:w="45" w:type="dxa"/>
+              <w:bottom w:w="45" w:type="dxa"/>
+              <w:left w:w="75" w:type="dxa"/>
+              <w:right w:w="75" w:type="dxa"/>
             </w:tcMar>
           </w:tcPr>
           <w:p>
@@ -2197,10 +2197,10 @@
               <w:right w:val="single" w:sz="5" w:space="0" w:color="475569"/>
             </w:tcBorders>
             <w:tcMar>
-              <w:top w:w="50" w:type="dxa"/>
-              <w:bottom w:w="50" w:type="dxa"/>
-              <w:left w:w="80" w:type="dxa"/>
-              <w:right w:w="80" w:type="dxa"/>
+              <w:top w:w="45" w:type="dxa"/>
+              <w:bottom w:w="45" w:type="dxa"/>
+              <w:left w:w="75" w:type="dxa"/>
+              <w:right w:w="75" w:type="dxa"/>
             </w:tcMar>
           </w:tcPr>
           <w:p>
@@ -2214,7 +2214,7 @@
                 <w:b/>
                 <w:sz w:val="18"/>
               </w:rPr>
-              <w:t>Physics-Based Multi-UAV Simulation &amp; MAPPO RL Training</w:t>
+              <w:t>Drone Simulation &amp; AI Swarm Training</w:t>
             </w:r>
           </w:p>
         </w:tc>
@@ -2228,10 +2228,10 @@
               <w:right w:val="single" w:sz="5" w:space="0" w:color="475569"/>
             </w:tcBorders>
             <w:tcMar>
-              <w:top w:w="50" w:type="dxa"/>
-              <w:bottom w:w="50" w:type="dxa"/>
-              <w:left w:w="80" w:type="dxa"/>
-              <w:right w:w="80" w:type="dxa"/>
+              <w:top w:w="45" w:type="dxa"/>
+              <w:bottom w:w="45" w:type="dxa"/>
+              <w:left w:w="75" w:type="dxa"/>
+              <w:right w:w="75" w:type="dxa"/>
             </w:tcMar>
           </w:tcPr>
           <w:p>
@@ -2245,7 +2245,7 @@
                 <w:b w:val="0"/>
                 <w:sz w:val="18"/>
               </w:rPr>
-              <w:t>Multi-agent simulation engine with 32-beam LiDAR emulation, converged MAPPO policy weights, and acoustic beacon search behavior.</w:t>
+              <w:t>Flight physics simulation with sensor rangefinders and a trained AI model for multi-drone coordination.</w:t>
             </w:r>
           </w:p>
         </w:tc>
@@ -2261,10 +2261,10 @@
               <w:right w:val="single" w:sz="5" w:space="0" w:color="475569"/>
             </w:tcBorders>
             <w:tcMar>
-              <w:top w:w="50" w:type="dxa"/>
-              <w:bottom w:w="50" w:type="dxa"/>
-              <w:left w:w="80" w:type="dxa"/>
-              <w:right w:w="80" w:type="dxa"/>
+              <w:top w:w="45" w:type="dxa"/>
+              <w:bottom w:w="45" w:type="dxa"/>
+              <w:left w:w="75" w:type="dxa"/>
+              <w:right w:w="75" w:type="dxa"/>
             </w:tcMar>
             <w:shd w:val="clear" w:color="auto" w:fill="F8FAFC"/>
           </w:tcPr>
@@ -2293,10 +2293,10 @@
               <w:right w:val="single" w:sz="5" w:space="0" w:color="475569"/>
             </w:tcBorders>
             <w:tcMar>
-              <w:top w:w="50" w:type="dxa"/>
-              <w:bottom w:w="50" w:type="dxa"/>
-              <w:left w:w="80" w:type="dxa"/>
-              <w:right w:w="80" w:type="dxa"/>
+              <w:top w:w="45" w:type="dxa"/>
+              <w:bottom w:w="45" w:type="dxa"/>
+              <w:left w:w="75" w:type="dxa"/>
+              <w:right w:w="75" w:type="dxa"/>
             </w:tcMar>
             <w:shd w:val="clear" w:color="auto" w:fill="F8FAFC"/>
           </w:tcPr>
@@ -2327,10 +2327,10 @@
               <w:right w:val="single" w:sz="5" w:space="0" w:color="475569"/>
             </w:tcBorders>
             <w:tcMar>
-              <w:top w:w="50" w:type="dxa"/>
-              <w:bottom w:w="50" w:type="dxa"/>
-              <w:left w:w="80" w:type="dxa"/>
-              <w:right w:w="80" w:type="dxa"/>
+              <w:top w:w="45" w:type="dxa"/>
+              <w:bottom w:w="45" w:type="dxa"/>
+              <w:left w:w="75" w:type="dxa"/>
+              <w:right w:w="75" w:type="dxa"/>
             </w:tcMar>
             <w:shd w:val="clear" w:color="auto" w:fill="F8FAFC"/>
           </w:tcPr>
@@ -2345,7 +2345,7 @@
                 <w:b/>
                 <w:sz w:val="18"/>
               </w:rPr>
-              <w:t>Dynamic Scenario Stress-Testing &amp; Algorithmic Benchmarking</w:t>
+              <w:t>Challenging Scenario Testing &amp; Performance Study</w:t>
             </w:r>
           </w:p>
         </w:tc>
@@ -2359,10 +2359,10 @@
               <w:right w:val="single" w:sz="5" w:space="0" w:color="475569"/>
             </w:tcBorders>
             <w:tcMar>
-              <w:top w:w="50" w:type="dxa"/>
-              <w:bottom w:w="50" w:type="dxa"/>
-              <w:left w:w="80" w:type="dxa"/>
-              <w:right w:w="80" w:type="dxa"/>
+              <w:top w:w="45" w:type="dxa"/>
+              <w:bottom w:w="45" w:type="dxa"/>
+              <w:left w:w="75" w:type="dxa"/>
+              <w:right w:w="75" w:type="dxa"/>
             </w:tcMar>
             <w:shd w:val="clear" w:color="auto" w:fill="F8FAFC"/>
           </w:tcPr>
@@ -2377,7 +2377,7 @@
                 <w:b w:val="0"/>
                 <w:sz w:val="18"/>
               </w:rPr>
-              <w:t>Empirical test results across moving obstacles, wire entanglements, and UAV failures; quantitative comparisons vs 3D A* and RRT*.</w:t>
+              <w:t>Experimental flight tests under wind, obstacle, and failure conditions; comparison against standard methods.</w:t>
             </w:r>
           </w:p>
         </w:tc>
@@ -2393,10 +2393,10 @@
               <w:right w:val="single" w:sz="5" w:space="0" w:color="475569"/>
             </w:tcBorders>
             <w:tcMar>
-              <w:top w:w="50" w:type="dxa"/>
-              <w:bottom w:w="50" w:type="dxa"/>
-              <w:left w:w="80" w:type="dxa"/>
-              <w:right w:w="80" w:type="dxa"/>
+              <w:top w:w="45" w:type="dxa"/>
+              <w:bottom w:w="45" w:type="dxa"/>
+              <w:left w:w="75" w:type="dxa"/>
+              <w:right w:w="75" w:type="dxa"/>
             </w:tcMar>
           </w:tcPr>
           <w:p>
@@ -2424,10 +2424,10 @@
               <w:right w:val="single" w:sz="5" w:space="0" w:color="475569"/>
             </w:tcBorders>
             <w:tcMar>
-              <w:top w:w="50" w:type="dxa"/>
-              <w:bottom w:w="50" w:type="dxa"/>
-              <w:left w:w="80" w:type="dxa"/>
-              <w:right w:w="80" w:type="dxa"/>
+              <w:top w:w="45" w:type="dxa"/>
+              <w:bottom w:w="45" w:type="dxa"/>
+              <w:left w:w="75" w:type="dxa"/>
+              <w:right w:w="75" w:type="dxa"/>
             </w:tcMar>
           </w:tcPr>
           <w:p>
@@ -2457,10 +2457,10 @@
               <w:right w:val="single" w:sz="5" w:space="0" w:color="475569"/>
             </w:tcBorders>
             <w:tcMar>
-              <w:top w:w="50" w:type="dxa"/>
-              <w:bottom w:w="50" w:type="dxa"/>
-              <w:left w:w="80" w:type="dxa"/>
-              <w:right w:w="80" w:type="dxa"/>
+              <w:top w:w="45" w:type="dxa"/>
+              <w:bottom w:w="45" w:type="dxa"/>
+              <w:left w:w="75" w:type="dxa"/>
+              <w:right w:w="75" w:type="dxa"/>
             </w:tcMar>
           </w:tcPr>
           <w:p>
@@ -2474,7 +2474,7 @@
                 <w:b/>
                 <w:sz w:val="18"/>
               </w:rPr>
-              <w:t>Tactical HUD Integration, Final Demonstration &amp; Thesis Defense</w:t>
+              <w:t>3D Visual Dashboard &amp; Final Thesis Defense</w:t>
             </w:r>
           </w:p>
         </w:tc>
@@ -2488,10 +2488,10 @@
               <w:right w:val="single" w:sz="5" w:space="0" w:color="475569"/>
             </w:tcBorders>
             <w:tcMar>
-              <w:top w:w="50" w:type="dxa"/>
-              <w:bottom w:w="50" w:type="dxa"/>
-              <w:left w:w="80" w:type="dxa"/>
-              <w:right w:w="80" w:type="dxa"/>
+              <w:top w:w="45" w:type="dxa"/>
+              <w:bottom w:w="45" w:type="dxa"/>
+              <w:left w:w="75" w:type="dxa"/>
+              <w:right w:w="75" w:type="dxa"/>
             </w:tcMar>
           </w:tcPr>
           <w:p>
@@ -2505,7 +2505,7 @@
                 <w:b w:val="0"/>
                 <w:sz w:val="18"/>
               </w:rPr>
-              <w:t>Interactive 3D WebGL mission control interface, complete software repository, finalized BS Space Science thesis dissertation, and oral defense.</w:t>
+              <w:t>Live 3D mission control dashboard, complete software codebase, final thesis report, and presentation defense.</w:t>
             </w:r>
           </w:p>
         </w:tc>
@@ -2549,10 +2549,10 @@
               <w:right w:val="single" w:sz="5" w:space="0" w:color="475569"/>
             </w:tcBorders>
             <w:tcMar>
-              <w:top w:w="60" w:type="dxa"/>
-              <w:bottom w:w="60" w:type="dxa"/>
-              <w:left w:w="100" w:type="dxa"/>
-              <w:right w:w="100" w:type="dxa"/>
+              <w:top w:w="55" w:type="dxa"/>
+              <w:bottom w:w="55" w:type="dxa"/>
+              <w:left w:w="90" w:type="dxa"/>
+              <w:right w:w="90" w:type="dxa"/>
             </w:tcMar>
           </w:tcPr>
           <w:p>
@@ -2565,14 +2565,14 @@
                 <w:b/>
                 <w:sz w:val="19"/>
               </w:rPr>
-              <w:t xml:space="preserve">1. End-to-End Software System: </w:t>
+              <w:t xml:space="preserve">1. Complete Simulation Software: </w:t>
             </w:r>
             <w:r>
               <w:rPr>
                 <w:rFonts w:ascii="Times New Roman" w:hAnsi="Times New Roman"/>
                 <w:sz w:val="19"/>
               </w:rPr>
-              <w:t>Fully automated software toolchain for satellite building extraction, 3D mesh manifold reconstruction, and multi-agent flight simulation.</w:t>
+              <w:t>A software program that converts satellite imagery into 3D city models and simulates multi-drone flight.</w:t>
             </w:r>
           </w:p>
           <w:p>
@@ -2585,14 +2585,14 @@
                 <w:b/>
                 <w:sz w:val="19"/>
               </w:rPr>
-              <w:t xml:space="preserve">2. Autonomous Swarm Policy Checkpoints: </w:t>
+              <w:t xml:space="preserve">2. Trained AI Flight Models: </w:t>
             </w:r>
             <w:r>
               <w:rPr>
                 <w:rFonts w:ascii="Times New Roman" w:hAnsi="Times New Roman"/>
                 <w:sz w:val="19"/>
               </w:rPr>
-              <w:t>Converged PyTorch neural network checkpoints implementing decentralized cooperative navigation and hazard avoidance.</w:t>
+              <w:t>Saved artificial intelligence models that allow multiple drones to fly autonomously as a coordinated team.</w:t>
             </w:r>
           </w:p>
           <w:p>
@@ -2605,14 +2605,14 @@
                 <w:b/>
                 <w:sz w:val="19"/>
               </w:rPr>
-              <w:t xml:space="preserve">3. Quantitative Simulation &amp; Comparative Study: </w:t>
+              <w:t xml:space="preserve">3. Comparative Performance Report: </w:t>
             </w:r>
             <w:r>
               <w:rPr>
                 <w:rFonts w:ascii="Times New Roman" w:hAnsi="Times New Roman"/>
                 <w:sz w:val="19"/>
               </w:rPr>
-              <w:t>Comprehensive comparative benchmarking dataset validating swarm flight performance against 3D A* and decentralized RRT*.</w:t>
+              <w:t>A structured experimental study comparing our AI drone swarm against standard flight path methods.</w:t>
             </w:r>
           </w:p>
           <w:p>
@@ -2625,14 +2625,14 @@
                 <w:b/>
                 <w:sz w:val="19"/>
               </w:rPr>
-              <w:t xml:space="preserve">4. High-Fidelity Simulator &amp; Tactical HUD: </w:t>
+              <w:t xml:space="preserve">4. Interactive 3D Visual Dashboard: </w:t>
             </w:r>
             <w:r>
               <w:rPr>
                 <w:rFonts w:ascii="Times New Roman" w:hAnsi="Times New Roman"/>
                 <w:sz w:val="19"/>
               </w:rPr>
-              <w:t>3D simulation environment and interactive WebGL Mission Control HUD for real-time mission telemetry and spatial analytics.</w:t>
+              <w:t>A user-friendly 3D web screen showing real-time drone locations, flight paths, and mission statistics.</w:t>
             </w:r>
           </w:p>
         </w:tc>
@@ -2671,10 +2671,10 @@
               <w:right w:val="single" w:sz="5" w:space="0" w:color="475569"/>
             </w:tcBorders>
             <w:tcMar>
-              <w:top w:w="60" w:type="dxa"/>
-              <w:bottom w:w="60" w:type="dxa"/>
-              <w:left w:w="100" w:type="dxa"/>
-              <w:right w:w="100" w:type="dxa"/>
+              <w:top w:w="55" w:type="dxa"/>
+              <w:bottom w:w="55" w:type="dxa"/>
+              <w:left w:w="90" w:type="dxa"/>
+              <w:right w:w="90" w:type="dxa"/>
             </w:tcMar>
           </w:tcPr>
           <w:p>
@@ -2687,14 +2687,14 @@
                 <w:b/>
                 <w:sz w:val="18"/>
               </w:rPr>
-              <w:t xml:space="preserve">1. Virtual Geospatial Environment: </w:t>
+              <w:t xml:space="preserve">1. Virtual 3D City Environment: </w:t>
             </w:r>
             <w:r>
               <w:rPr>
                 <w:rFonts w:ascii="Times New Roman" w:hAnsi="Times New Roman"/>
                 <w:sz w:val="18"/>
               </w:rPr>
-              <w:t>Cadastre-grade 3D environment generated from SpaceNet 2 satellite tiles, georeferenced in WGS84 (EPSG:4326), featuring accurate building geometries, terrain topography, and restricted flight volumes.</w:t>
+              <w:t>Accurate 3D city map created from satellite photos with realistic building shapes, ground elevation, and no-fly zones.</w:t>
             </w:r>
           </w:p>
           <w:p>
@@ -2707,14 +2707,14 @@
                 <w:b/>
                 <w:sz w:val="18"/>
               </w:rPr>
-              <w:t xml:space="preserve">2. Digital Twin State Engine: </w:t>
+              <w:t xml:space="preserve">2. Digital Twin State Manager: </w:t>
             </w:r>
             <w:r>
               <w:rPr>
                 <w:rFonts w:ascii="Times New Roman" w:hAnsi="Times New Roman"/>
                 <w:sz w:val="18"/>
               </w:rPr>
-              <w:t>Real-time spatial state manager synchronizing environmental changes, multi-agent position histories, and dynamic threat boundaries.</w:t>
+              <w:t>Software module that continuously tracks building changes, weather, and real-time drone coordinates.</w:t>
             </w:r>
           </w:p>
           <w:p>
@@ -2727,14 +2727,14 @@
                 <w:b/>
                 <w:sz w:val="18"/>
               </w:rPr>
-              <w:t xml:space="preserve">3. Multi-UAV Simulation Module: </w:t>
+              <w:t xml:space="preserve">3. Multi-Drone Flight Simulator: </w:t>
             </w:r>
             <w:r>
               <w:rPr>
                 <w:rFonts w:ascii="Times New Roman" w:hAnsi="Times New Roman"/>
                 <w:sz w:val="18"/>
               </w:rPr>
-              <w:t>Physics-based kinematic engine simulating heterogeneous quadrotor agents under 6-DOF rigid-body dynamics, aerodynamic rotor drag, and battery discharge curves.</w:t>
+              <w:t>Physics-based flight engine that simulates quadcopter movement, motor lift, drag, and battery drain.</w:t>
             </w:r>
           </w:p>
           <w:p>
@@ -2747,14 +2747,14 @@
                 <w:b/>
                 <w:sz w:val="18"/>
               </w:rPr>
-              <w:t xml:space="preserve">4. AI Swarm-Control Module: </w:t>
+              <w:t xml:space="preserve">4. AI Swarm Controller: </w:t>
             </w:r>
             <w:r>
               <w:rPr>
                 <w:rFonts w:ascii="Times New Roman" w:hAnsi="Times New Roman"/>
                 <w:sz w:val="18"/>
               </w:rPr>
-              <w:t>MAPPO multi-agent reinforcement learning architecture utilizing Centralized Training with Decentralized Execution (CTDE) for collision-free cooperative navigation.</w:t>
+              <w:t>Multi-agent reinforcement learning algorithm (MAPPO) that controls individual drone speed, direction, and team spacing.</w:t>
             </w:r>
           </w:p>
           <w:p>
@@ -2767,14 +2767,14 @@
                 <w:b/>
                 <w:sz w:val="18"/>
               </w:rPr>
-              <w:t xml:space="preserve">5. Dynamic Scenario Generator: </w:t>
+              <w:t xml:space="preserve">5. Dynamic Hazard Module: </w:t>
             </w:r>
             <w:r>
               <w:rPr>
                 <w:rFonts w:ascii="Times New Roman" w:hAnsi="Times New Roman"/>
                 <w:sz w:val="18"/>
               </w:rPr>
-              <w:t>Simulation module injecting moving obstacles, localized wind gusts, catenary wire obstacles, and UAV communication packet dropouts.</w:t>
+              <w:t>Scenario tool that adds moving obstacles, wind gusts, thin overhead power lines, and drone motor dropouts.</w:t>
             </w:r>
           </w:p>
           <w:p>
@@ -2787,14 +2787,14 @@
                 <w:b/>
                 <w:sz w:val="18"/>
               </w:rPr>
-              <w:t xml:space="preserve">6. Mission Management Module: </w:t>
+              <w:t xml:space="preserve">6. Mission Planning Module: </w:t>
             </w:r>
             <w:r>
               <w:rPr>
                 <w:rFonts w:ascii="Times New Roman" w:hAnsi="Times New Roman"/>
                 <w:sz w:val="18"/>
               </w:rPr>
-              <w:t>Mission coordinator managing search patterns, acoustic rescue beacon homing, formation tracking, and automated return-to-base protocols.</w:t>
+              <w:t>Sets search-and-rescue mission goals, distributes search zones among drones, and manages return-to-base.</w:t>
             </w:r>
           </w:p>
           <w:p>
@@ -2807,14 +2807,14 @@
                 <w:b/>
                 <w:sz w:val="18"/>
               </w:rPr>
-              <w:t xml:space="preserve">7. Performance Evaluation Module: </w:t>
+              <w:t xml:space="preserve">7. Automatic Evaluation Module: </w:t>
             </w:r>
             <w:r>
               <w:rPr>
                 <w:rFonts w:ascii="Times New Roman" w:hAnsi="Times New Roman"/>
                 <w:sz w:val="18"/>
               </w:rPr>
-              <w:t>Automated logging engine tracking mission completion duration, area coverage rate, collision frequency, and energy consumption (Wh).</w:t>
+              <w:t>Automatically logs flight duration, search area covered, battery consumed, and safety metrics.</w:t>
             </w:r>
           </w:p>
           <w:p>
@@ -2827,14 +2827,14 @@
                 <w:b/>
                 <w:sz w:val="18"/>
               </w:rPr>
-              <w:t xml:space="preserve">8. Tactical Visualization Interface: </w:t>
+              <w:t xml:space="preserve">8. 3D Visual Control Dashboard: </w:t>
             </w:r>
             <w:r>
               <w:rPr>
                 <w:rFonts w:ascii="Times New Roman" w:hAnsi="Times New Roman"/>
                 <w:sz w:val="18"/>
               </w:rPr>
-              <w:t>Interactive 3D WebGL HUD rendering swarm trajectories, drone health telemetries, and operational status cycling.</w:t>
+              <w:t>Interactive web screen displaying 3D flight paths, individual drone status cards, and live mission progress.</w:t>
             </w:r>
           </w:p>
           <w:p>
@@ -2847,14 +2847,14 @@
                 <w:b/>
                 <w:sz w:val="18"/>
               </w:rPr>
-              <w:t xml:space="preserve">9. Experimental Benchmark Suite: </w:t>
+              <w:t xml:space="preserve">9. Standard Comparison Test Suite: </w:t>
             </w:r>
             <w:r>
               <w:rPr>
                 <w:rFonts w:ascii="Times New Roman" w:hAnsi="Times New Roman"/>
                 <w:sz w:val="18"/>
               </w:rPr>
-              <w:t>Standardized evaluation framework executing head-to-head performance comparisons against centralized 3D A* and decentralized RRT* algorithms.</w:t>
+              <w:t>Test suite comparing our AI drone swarm against standard textbook algorithms (like A* and RRT*).</w:t>
             </w:r>
           </w:p>
         </w:tc>
@@ -2893,10 +2893,10 @@
               <w:right w:val="single" w:sz="5" w:space="0" w:color="475569"/>
             </w:tcBorders>
             <w:tcMar>
-              <w:top w:w="60" w:type="dxa"/>
-              <w:bottom w:w="60" w:type="dxa"/>
-              <w:left w:w="100" w:type="dxa"/>
-              <w:right w:w="100" w:type="dxa"/>
+              <w:top w:w="55" w:type="dxa"/>
+              <w:bottom w:w="55" w:type="dxa"/>
+              <w:left w:w="90" w:type="dxa"/>
+              <w:right w:w="90" w:type="dxa"/>
             </w:tcMar>
           </w:tcPr>
           <w:p>
@@ -2909,14 +2909,14 @@
                 <w:b/>
                 <w:sz w:val="18"/>
               </w:rPr>
-              <w:t xml:space="preserve">1. Development Workstation: </w:t>
+              <w:t xml:space="preserve">1. Standard Computer / Laptop: </w:t>
             </w:r>
             <w:r>
               <w:rPr>
                 <w:rFonts w:ascii="Times New Roman" w:hAnsi="Times New Roman"/>
                 <w:sz w:val="18"/>
               </w:rPr>
-              <w:t>Standard research workstation or laptop equipped with a multi-core processor (Intel Core i7/i9 or AMD Ryzen) and 16+ GB RAM.</w:t>
+              <w:t>A development laptop or desktop computer with a multi-core processor and 16 GB of RAM.</w:t>
             </w:r>
           </w:p>
           <w:p>
@@ -2929,14 +2929,14 @@
                 <w:b/>
                 <w:sz w:val="18"/>
               </w:rPr>
-              <w:t xml:space="preserve">2. GPU Compute Capability: </w:t>
+              <w:t xml:space="preserve">2. Graphics Card (NVIDIA GPU): </w:t>
             </w:r>
             <w:r>
               <w:rPr>
                 <w:rFonts w:ascii="Times New Roman" w:hAnsi="Times New Roman"/>
                 <w:sz w:val="18"/>
               </w:rPr>
-              <w:t>Dedicated NVIDIA GPU (GeForce RTX/GTX series, CUDA 12.x compatible) for accelerated deep neural network training and real-time 3D simulation physics.</w:t>
+              <w:t>Dedicated NVIDIA graphics card (GeForce RTX/GTX series) to run AI training and smooth 3D simulation.</w:t>
             </w:r>
           </w:p>
           <w:p>
@@ -2949,14 +2949,14 @@
                 <w:b/>
                 <w:sz w:val="18"/>
               </w:rPr>
-              <w:t xml:space="preserve">3. GIS &amp; Simulation Software Toolchain: </w:t>
+              <w:t xml:space="preserve">3. Free &amp; Open-Source Software: </w:t>
             </w:r>
             <w:r>
               <w:rPr>
                 <w:rFonts w:ascii="Times New Roman" w:hAnsi="Times New Roman"/>
                 <w:sz w:val="18"/>
               </w:rPr>
-              <w:t>Python 3.10+ virtual environment, PyTorch deep learning framework, GDAL/Rasterio/GeoPandas geospatial libraries, Blender 4.x (bpy), and Unreal Engine 5.4.</w:t>
+              <w:t>Python, PyTorch (AI library), GIS mapping tools, Blender, and Unreal Engine simulation tools.</w:t>
             </w:r>
           </w:p>
           <w:p>
@@ -2969,14 +2969,14 @@
                 <w:b/>
                 <w:sz w:val="18"/>
               </w:rPr>
-              <w:t xml:space="preserve">4. Earth Observation Datasets &amp; Connectivity: </w:t>
+              <w:t xml:space="preserve">4. Public Datasets &amp; Internet: </w:t>
             </w:r>
             <w:r>
               <w:rPr>
                 <w:rFonts w:ascii="Times New Roman" w:hAnsi="Times New Roman"/>
                 <w:sz w:val="18"/>
               </w:rPr>
-              <w:t>High-speed internet connectivity for streaming AWS Terrarium DEM tiles and SpaceNet 2 satellite imagery.</w:t>
+              <w:t>Internet access to download free public satellite imagery (SpaceNet 2) and ground elevation data.</w:t>
             </w:r>
           </w:p>
           <w:p>
@@ -2989,14 +2989,14 @@
                 <w:b/>
                 <w:sz w:val="18"/>
               </w:rPr>
-              <w:t xml:space="preserve">5. Hardware-in-the-Loop Demonstration (Optional): </w:t>
+              <w:t xml:space="preserve">5. Physical Drone Demonstration (Optional): </w:t>
             </w:r>
             <w:r>
               <w:rPr>
                 <w:rFonts w:ascii="Times New Roman" w:hAnsi="Times New Roman"/>
                 <w:sz w:val="18"/>
               </w:rPr>
-              <w:t>An optional physical quadrotor or Pixhawk flight controller telemetry link may be incorporated for ground station telemetry playback if laboratory hardware is made available.</w:t>
+              <w:t>If laboratory drone hardware is available, real flight telemetry can be connected to the simulation for demonstration.</w:t>
             </w:r>
           </w:p>
         </w:tc>
@@ -3040,10 +3040,10 @@
               <w:right w:val="single" w:sz="5" w:space="0" w:color="475569"/>
             </w:tcBorders>
             <w:tcMar>
-              <w:top w:w="60" w:type="dxa"/>
-              <w:bottom w:w="60" w:type="dxa"/>
-              <w:left w:w="100" w:type="dxa"/>
-              <w:right w:w="100" w:type="dxa"/>
+              <w:top w:w="55" w:type="dxa"/>
+              <w:bottom w:w="55" w:type="dxa"/>
+              <w:left w:w="90" w:type="dxa"/>
+              <w:right w:w="90" w:type="dxa"/>
             </w:tcMar>
           </w:tcPr>
           <w:p>
@@ -3056,14 +3056,14 @@
                 <w:b/>
                 <w:sz w:val="19"/>
               </w:rPr>
-              <w:t xml:space="preserve">1. Risk-Free, Low-Cost Swarm Development: </w:t>
+              <w:t xml:space="preserve">1. Zero Risk and Low Cost: </w:t>
             </w:r>
             <w:r>
               <w:rPr>
                 <w:rFonts w:ascii="Times New Roman" w:hAnsi="Times New Roman"/>
                 <w:sz w:val="19"/>
               </w:rPr>
-              <w:t>Enables rapid prototyping and verification of multi-UAV swarm control policies without incurring drone crash costs or flight-safety hazards.</w:t>
+              <w:t>Allows developing and testing drone swarm coordination safely on a computer without risking expensive drone crashes or physical injuries.</w:t>
             </w:r>
           </w:p>
           <w:p>
@@ -3076,14 +3076,14 @@
                 <w:b/>
                 <w:sz w:val="19"/>
               </w:rPr>
-              <w:t xml:space="preserve">2. Scientific Repeatability: </w:t>
+              <w:t xml:space="preserve">2. Repeatable Testing: </w:t>
             </w:r>
             <w:r>
               <w:rPr>
                 <w:rFonts w:ascii="Times New Roman" w:hAnsi="Times New Roman"/>
                 <w:sz w:val="19"/>
               </w:rPr>
-              <w:t>Provides a deterministic, repeatable operational environment for rigorous scientific comparison across disparate multi-agent algorithms under identical environmental states.</w:t>
+              <w:t>Allows running the exact same disaster mission dozens of times under controlled conditions to systematically test and improve the AI.</w:t>
             </w:r>
           </w:p>
           <w:p>
@@ -3096,14 +3096,14 @@
                 <w:b/>
                 <w:sz w:val="19"/>
               </w:rPr>
-              <w:t xml:space="preserve">3. Robustness in High-Entropy &amp; GPS-Degraded Environments: </w:t>
+              <w:t xml:space="preserve">3. Prepares Drones for Real Hazards: </w:t>
             </w:r>
             <w:r>
               <w:rPr>
                 <w:rFonts w:ascii="Times New Roman" w:hAnsi="Times New Roman"/>
                 <w:sz w:val="19"/>
               </w:rPr>
-              <w:t>Enables evaluation of swarm adaptability under communication outages, moving obstacles, micro-hazards (catenary powerlines), and individual agent motor failures.</w:t>
+              <w:t>Trains drones to safely handle unexpected emergencies like sudden wind gusts, moving obstacles, thin overhead power lines, and motor failures.</w:t>
             </w:r>
           </w:p>
           <w:p>
@@ -3116,14 +3116,14 @@
                 <w:b/>
                 <w:sz w:val="19"/>
               </w:rPr>
-              <w:t xml:space="preserve">4. Direct Fusion of Space Science &amp; Autonomous Robotics: </w:t>
+              <w:t xml:space="preserve">4. Connects Satellite Data with Robotics: </w:t>
             </w:r>
             <w:r>
               <w:rPr>
                 <w:rFonts w:ascii="Times New Roman" w:hAnsi="Times New Roman"/>
                 <w:sz w:val="19"/>
               </w:rPr>
-              <w:t>Demonstrates seamless integration of satellite remote sensing, photogrammetric DEMs, and GIS spatial analytics directly into autonomous robotic navigation pipelines.</w:t>
+              <w:t>Demonstrates a practical way to use Space Science satellite photos and elevation maps directly in autonomous drone navigation.</w:t>
             </w:r>
           </w:p>
           <w:p>
@@ -3136,14 +3136,14 @@
                 <w:b/>
                 <w:sz w:val="19"/>
               </w:rPr>
-              <w:t xml:space="preserve">5. Search and Rescue (SAR) &amp; Disaster Assessment: </w:t>
+              <w:t xml:space="preserve">5. Useful for Disaster Relief &amp; Search and Rescue: </w:t>
             </w:r>
             <w:r>
               <w:rPr>
                 <w:rFonts w:ascii="Times New Roman" w:hAnsi="Times New Roman"/>
                 <w:sz w:val="19"/>
               </w:rPr>
-              <w:t>Directly applicable to post-disaster reconnaissance (earthquake structural collapse, flood assessment, acoustic survivor locator homing).</w:t>
+              <w:t>Helps search-and-rescue teams locate survivors, map earthquake damage, or assess flooded areas quickly.</w:t>
             </w:r>
           </w:p>
           <w:p>
@@ -3156,14 +3156,14 @@
                 <w:b/>
                 <w:sz w:val="19"/>
               </w:rPr>
-              <w:t xml:space="preserve">6. Quantitative Multi-Objective Benchmarking: </w:t>
+              <w:t xml:space="preserve">6. Saves Flight Time and Battery: </w:t>
             </w:r>
             <w:r>
               <w:rPr>
                 <w:rFonts w:ascii="Times New Roman" w:hAnsi="Times New Roman"/>
                 <w:sz w:val="19"/>
               </w:rPr>
-              <w:t>Establishes empirical baselines comparing cooperative reinforcement learning against classical centralized 3D A* and decentralized RRT* algorithms.</w:t>
+              <w:t>Teaches drones to pick efficient flight paths, helping them complete missions faster and extend battery life.</w:t>
             </w:r>
           </w:p>
           <w:p>
@@ -3176,14 +3176,14 @@
                 <w:b/>
                 <w:sz w:val="19"/>
               </w:rPr>
-              <w:t xml:space="preserve">7. Foundation for Physical Hardware-in-the-Loop (HIL): </w:t>
+              <w:t xml:space="preserve">7. Foundation for Future IST Projects: </w:t>
             </w:r>
             <w:r>
               <w:rPr>
                 <w:rFonts w:ascii="Times New Roman" w:hAnsi="Times New Roman"/>
                 <w:sz w:val="19"/>
               </w:rPr>
-              <w:t>Establishes standard MAVLink telemetry and control interfaces readily transferable to physical multi-UAV platforms in future research.</w:t>
+              <w:t>Creates a reusable 3D simulation platform that future students and faculty at IST can use for subsequent drone and AI research.</w:t>
             </w:r>
           </w:p>
         </w:tc>
@@ -3191,7 +3191,7 @@
     </w:tbl>
     <w:p>
       <w:pPr>
-        <w:spacing w:before="200" w:after="60" w:line="264" w:lineRule="auto"/>
+        <w:spacing w:before="160" w:after="60" w:line="264" w:lineRule="auto"/>
       </w:pPr>
       <w:r>
         <w:rPr>
@@ -3215,7 +3215,7 @@
     </w:p>
     <w:p>
       <w:pPr>
-        <w:spacing w:before="40" w:after="200" w:line="264" w:lineRule="auto"/>
+        <w:spacing w:before="40" w:after="160" w:line="264" w:lineRule="auto"/>
       </w:pPr>
       <w:r>
         <w:rPr>
@@ -3247,10 +3247,10 @@
               <w:right w:val="single" w:sz="5" w:space="0" w:color="475569"/>
             </w:tcBorders>
             <w:tcMar>
-              <w:top w:w="70" w:type="dxa"/>
-              <w:bottom w:w="70" w:type="dxa"/>
-              <w:left w:w="90" w:type="dxa"/>
-              <w:right w:w="90" w:type="dxa"/>
+              <w:top w:w="60" w:type="dxa"/>
+              <w:bottom w:w="60" w:type="dxa"/>
+              <w:left w:w="80" w:type="dxa"/>
+              <w:right w:w="80" w:type="dxa"/>
             </w:tcMar>
             <w:shd w:val="clear" w:color="auto" w:fill="F8FAFC"/>
           </w:tcPr>
@@ -3268,7 +3268,7 @@
           </w:p>
           <w:p>
             <w:pPr>
-              <w:spacing w:before="120" w:after="40" w:line="252" w:lineRule="auto"/>
+              <w:spacing w:before="100" w:after="40" w:line="252" w:lineRule="auto"/>
             </w:pPr>
             <w:r>
               <w:rPr>
@@ -3283,7 +3283,7 @@
           </w:p>
           <w:p>
             <w:pPr>
-              <w:spacing w:before="400" w:after="40"/>
+              <w:spacing w:before="360" w:after="40"/>
             </w:pPr>
             <w:r>
               <w:rPr>
@@ -3303,10 +3303,10 @@
               <w:right w:val="single" w:sz="5" w:space="0" w:color="475569"/>
             </w:tcBorders>
             <w:tcMar>
-              <w:top w:w="70" w:type="dxa"/>
-              <w:bottom w:w="70" w:type="dxa"/>
-              <w:left w:w="90" w:type="dxa"/>
-              <w:right w:w="90" w:type="dxa"/>
+              <w:top w:w="60" w:type="dxa"/>
+              <w:bottom w:w="60" w:type="dxa"/>
+              <w:left w:w="80" w:type="dxa"/>
+              <w:right w:w="80" w:type="dxa"/>
             </w:tcMar>
             <w:shd w:val="clear" w:color="auto" w:fill="F8FAFC"/>
           </w:tcPr>
@@ -3324,7 +3324,7 @@
           </w:p>
           <w:p>
             <w:pPr>
-              <w:spacing w:before="120" w:after="40" w:line="252" w:lineRule="auto"/>
+              <w:spacing w:before="100" w:after="40" w:line="252" w:lineRule="auto"/>
             </w:pPr>
             <w:r>
               <w:rPr>
@@ -3339,7 +3339,7 @@
           </w:p>
           <w:p>
             <w:pPr>
-              <w:spacing w:before="400" w:after="40"/>
+              <w:spacing w:before="360" w:after="40"/>
             </w:pPr>
             <w:r>
               <w:rPr>
@@ -3354,7 +3354,7 @@
     <w:sectPr>
       <w:headerReference w:type="default" r:id="rId9"/>
       <w:pgSz w:w="12240" w:h="15840"/>
-      <w:pgMar w:top="720" w:right="1008" w:bottom="720" w:left="1008" w:header="432" w:footer="720" w:gutter="0"/>
+      <w:pgMar w:top="720" w:right="1008" w:bottom="720" w:left="1008" w:header="403" w:footer="720" w:gutter="0"/>
       <w:cols w:space="720"/>
       <w:docGrid w:linePitch="360"/>
     </w:sectPr>
@@ -3394,10 +3394,10 @@
             <w:right w:val="single" w:sz="5" w:space="0" w:color="475569"/>
           </w:tcBorders>
           <w:tcMar>
-            <w:top w:w="40" w:type="dxa"/>
-            <w:bottom w:w="40" w:type="dxa"/>
-            <w:left w:w="80" w:type="dxa"/>
-            <w:right w:w="80" w:type="dxa"/>
+            <w:top w:w="35" w:type="dxa"/>
+            <w:bottom w:w="35" w:type="dxa"/>
+            <w:left w:w="70" w:type="dxa"/>
+            <w:right w:w="70" w:type="dxa"/>
           </w:tcMar>
         </w:tcPr>
         <w:p>
@@ -3425,10 +3425,10 @@
             <w:right w:val="single" w:sz="5" w:space="0" w:color="475569"/>
           </w:tcBorders>
           <w:tcMar>
-            <w:top w:w="40" w:type="dxa"/>
-            <w:bottom w:w="40" w:type="dxa"/>
-            <w:left w:w="80" w:type="dxa"/>
-            <w:right w:w="80" w:type="dxa"/>
+            <w:top w:w="35" w:type="dxa"/>
+            <w:bottom w:w="35" w:type="dxa"/>
+            <w:left w:w="70" w:type="dxa"/>
+            <w:right w:w="70" w:type="dxa"/>
           </w:tcMar>
           <w:shd w:val="clear" w:color="auto" w:fill="F1F5F9"/>
         </w:tcPr>
@@ -3457,10 +3457,10 @@
             <w:right w:val="single" w:sz="5" w:space="0" w:color="475569"/>
           </w:tcBorders>
           <w:tcMar>
-            <w:top w:w="40" w:type="dxa"/>
-            <w:bottom w:w="40" w:type="dxa"/>
-            <w:left w:w="80" w:type="dxa"/>
-            <w:right w:w="80" w:type="dxa"/>
+            <w:top w:w="35" w:type="dxa"/>
+            <w:bottom w:w="35" w:type="dxa"/>
+            <w:left w:w="70" w:type="dxa"/>
+            <w:right w:w="70" w:type="dxa"/>
           </w:tcMar>
         </w:tcPr>
         <w:p>
@@ -3490,10 +3490,10 @@
             <w:right w:val="single" w:sz="5" w:space="0" w:color="475569"/>
           </w:tcBorders>
           <w:tcMar>
-            <w:top w:w="40" w:type="dxa"/>
-            <w:bottom w:w="40" w:type="dxa"/>
-            <w:left w:w="80" w:type="dxa"/>
-            <w:right w:w="80" w:type="dxa"/>
+            <w:top w:w="35" w:type="dxa"/>
+            <w:bottom w:w="35" w:type="dxa"/>
+            <w:left w:w="70" w:type="dxa"/>
+            <w:right w:w="70" w:type="dxa"/>
           </w:tcMar>
         </w:tcPr>
         <w:p>
@@ -3521,10 +3521,10 @@
             <w:right w:val="single" w:sz="5" w:space="0" w:color="475569"/>
           </w:tcBorders>
           <w:tcMar>
-            <w:top w:w="40" w:type="dxa"/>
-            <w:bottom w:w="40" w:type="dxa"/>
-            <w:left w:w="80" w:type="dxa"/>
-            <w:right w:w="80" w:type="dxa"/>
+            <w:top w:w="35" w:type="dxa"/>
+            <w:bottom w:w="35" w:type="dxa"/>
+            <w:left w:w="70" w:type="dxa"/>
+            <w:right w:w="70" w:type="dxa"/>
           </w:tcMar>
           <w:shd w:val="clear" w:color="auto" w:fill="F1F5F9"/>
         </w:tcPr>
@@ -3553,10 +3553,10 @@
             <w:right w:val="single" w:sz="5" w:space="0" w:color="475569"/>
           </w:tcBorders>
           <w:tcMar>
-            <w:top w:w="40" w:type="dxa"/>
-            <w:bottom w:w="40" w:type="dxa"/>
-            <w:left w:w="80" w:type="dxa"/>
-            <w:right w:w="80" w:type="dxa"/>
+            <w:top w:w="35" w:type="dxa"/>
+            <w:bottom w:w="35" w:type="dxa"/>
+            <w:left w:w="70" w:type="dxa"/>
+            <w:right w:w="70" w:type="dxa"/>
           </w:tcMar>
         </w:tcPr>
         <w:p>
@@ -3586,10 +3586,10 @@
             <w:right w:val="single" w:sz="5" w:space="0" w:color="475569"/>
           </w:tcBorders>
           <w:tcMar>
-            <w:top w:w="40" w:type="dxa"/>
-            <w:bottom w:w="40" w:type="dxa"/>
-            <w:left w:w="80" w:type="dxa"/>
-            <w:right w:w="80" w:type="dxa"/>
+            <w:top w:w="35" w:type="dxa"/>
+            <w:bottom w:w="35" w:type="dxa"/>
+            <w:left w:w="70" w:type="dxa"/>
+            <w:right w:w="70" w:type="dxa"/>
           </w:tcMar>
         </w:tcPr>
         <w:p>
@@ -3617,10 +3617,10 @@
             <w:right w:val="single" w:sz="5" w:space="0" w:color="475569"/>
           </w:tcBorders>
           <w:tcMar>
-            <w:top w:w="40" w:type="dxa"/>
-            <w:bottom w:w="40" w:type="dxa"/>
-            <w:left w:w="80" w:type="dxa"/>
-            <w:right w:w="80" w:type="dxa"/>
+            <w:top w:w="35" w:type="dxa"/>
+            <w:bottom w:w="35" w:type="dxa"/>
+            <w:left w:w="70" w:type="dxa"/>
+            <w:right w:w="70" w:type="dxa"/>
           </w:tcMar>
           <w:shd w:val="clear" w:color="auto" w:fill="F1F5F9"/>
         </w:tcPr>
@@ -3649,10 +3649,10 @@
             <w:right w:val="single" w:sz="5" w:space="0" w:color="475569"/>
           </w:tcBorders>
           <w:tcMar>
-            <w:top w:w="40" w:type="dxa"/>
-            <w:bottom w:w="40" w:type="dxa"/>
-            <w:left w:w="80" w:type="dxa"/>
-            <w:right w:w="80" w:type="dxa"/>
+            <w:top w:w="35" w:type="dxa"/>
+            <w:bottom w:w="35" w:type="dxa"/>
+            <w:left w:w="70" w:type="dxa"/>
+            <w:right w:w="70" w:type="dxa"/>
           </w:tcMar>
         </w:tcPr>
         <w:p>

</xml_diff>